<commit_message>
Add a new section to the Hackathon submission template to include a brief summary of the project, highlighting key features and objectives.
</commit_message>
<xml_diff>
--- a/docs/Hackathon submission template.docx
+++ b/docs/Hackathon submission template.docx
@@ -190,15 +190,7 @@
                       <w:b/>
                       <w:bCs/>
                     </w:rPr>
-                    <w:t xml:space="preserve">Team </w:t>
-                  </w:r>
-                  <w:r>
-                    <w:rPr>
-                      <w:rFonts w:ascii="Old Standard TT" w:eastAsia="Old Standard TT" w:hAnsi="Old Standard TT" w:cs="Old Standard TT"/>
-                      <w:b/>
-                      <w:bCs/>
-                    </w:rPr>
-                    <w:t>Name:</w:t>
+                    <w:t>Team Name:</w:t>
                   </w:r>
                   <w:r>
                     <w:rPr>
@@ -264,7 +256,7 @@
                           <w:rPr>
                             <w:rFonts w:ascii="Old Standard TT" w:eastAsia="Old Standard TT" w:hAnsi="Old Standard TT" w:cs="Old Standard TT"/>
                           </w:rPr>
-                          <w:t>Author name 1</w:t>
+                          <w:t>Moegamat Samsodien</w:t>
                         </w:r>
                       </w:p>
                     </w:tc>

</xml_diff>